<commit_message>
fix: cambio del num2words en descuentos
</commit_message>
<xml_diff>
--- a/server-flask/src/infrastructure/documents/templates/descuento_template.docx
+++ b/server-flask/src/infrastructure/documents/templates/descuento_template.docx
@@ -1,6 +1,6 @@
 
 <file path=word/document.xml><?xml version="1.0" encoding="utf-8"?>
-<w:document xmlns:wpc="http://schemas.microsoft.com/office/word/2010/wordprocessingCanvas" xmlns:cx="http://schemas.microsoft.com/office/drawing/2014/chartex" xmlns:cx1="http://schemas.microsoft.com/office/drawing/2015/9/8/chartex" xmlns:cx2="http://schemas.microsoft.com/office/drawing/2015/10/21/chartex" xmlns:cx3="http://schemas.microsoft.com/office/drawing/2016/5/9/chartex" xmlns:cx4="http://schemas.microsoft.com/office/drawing/2016/5/10/chartex" xmlns:cx5="http://schemas.microsoft.com/office/drawing/2016/5/11/chartex" xmlns:cx6="http://schemas.microsoft.com/office/drawing/2016/5/12/chartex" xmlns:cx7="http://schemas.microsoft.com/office/drawing/2016/5/13/chartex" xmlns:cx8="http://schemas.microsoft.com/office/drawing/2016/5/14/chartex" xmlns:mc="http://schemas.openxmlformats.org/markup-compatibility/2006" xmlns:aink="http://schemas.microsoft.com/office/drawing/2016/ink" xmlns:am3d="http://schemas.microsoft.com/office/drawing/2017/model3d" xmlns:o="urn:schemas-microsoft-com:office:office" xmlns:r="http://schemas.openxmlformats.org/officeDocument/2006/relationships" xmlns:m="http://schemas.openxmlformats.org/officeDocument/2006/math" xmlns:v="urn:schemas-microsoft-com:vml" xmlns:wp14="http://schemas.microsoft.com/office/word/2010/wordprocessingDrawing" xmlns:wp="http://schemas.openxmlformats.org/drawingml/2006/wordprocessingDrawing" xmlns:w10="urn:schemas-microsoft-com:office:word" xmlns:w="http://schemas.openxmlformats.org/wordprocessingml/2006/main" xmlns:w14="http://schemas.microsoft.com/office/word/2010/wordml" xmlns:w15="http://schemas.microsoft.com/office/word/2012/wordml" xmlns:w16cex="http://schemas.microsoft.com/office/word/2018/wordml/cex" xmlns:w16cid="http://schemas.microsoft.com/office/word/2016/wordml/cid" xmlns:w16="http://schemas.microsoft.com/office/word/2018/wordml" xmlns:w16se="http://schemas.microsoft.com/office/word/2015/wordml/symex" xmlns:wpg="http://schemas.microsoft.com/office/word/2010/wordprocessingGroup" xmlns:wpi="http://schemas.microsoft.com/office/word/2010/wordprocessingInk" xmlns:wne="http://schemas.microsoft.com/office/word/2006/wordml" xmlns:wps="http://schemas.microsoft.com/office/word/2010/wordprocessingShape" mc:Ignorable="w14 w15 w16se w16cid w16 w16cex wp14">
+<w:document xmlns:wpc="http://schemas.microsoft.com/office/word/2010/wordprocessingCanvas" xmlns:cx="http://schemas.microsoft.com/office/drawing/2014/chartex" xmlns:cx1="http://schemas.microsoft.com/office/drawing/2015/9/8/chartex" xmlns:mc="http://schemas.openxmlformats.org/markup-compatibility/2006" xmlns:o="urn:schemas-microsoft-com:office:office" xmlns:r="http://schemas.openxmlformats.org/officeDocument/2006/relationships" xmlns:m="http://schemas.openxmlformats.org/officeDocument/2006/math" xmlns:v="urn:schemas-microsoft-com:vml" xmlns:wp14="http://schemas.microsoft.com/office/word/2010/wordprocessingDrawing" xmlns:wp="http://schemas.openxmlformats.org/drawingml/2006/wordprocessingDrawing" xmlns:w10="urn:schemas-microsoft-com:office:word" xmlns:w="http://schemas.openxmlformats.org/wordprocessingml/2006/main" xmlns:w14="http://schemas.microsoft.com/office/word/2010/wordml" xmlns:w15="http://schemas.microsoft.com/office/word/2012/wordml" xmlns:w16se="http://schemas.microsoft.com/office/word/2015/wordml/symex" xmlns:wpg="http://schemas.microsoft.com/office/word/2010/wordprocessingGroup" xmlns:wpi="http://schemas.microsoft.com/office/word/2010/wordprocessingInk" xmlns:wne="http://schemas.microsoft.com/office/word/2006/wordml" xmlns:wps="http://schemas.microsoft.com/office/word/2010/wordprocessingShape" mc:Ignorable="w14 w15 w16se wp14">
   <w:body>
     <w:p>
       <w:pPr>
@@ -54,7 +54,23 @@
           <w:rFonts w:ascii="Arial" w:hAnsi="Arial" w:cs="Arial"/>
           <w:sz w:val="22"/>
         </w:rPr>
-        <w:t>{{actual_date_narrative}}</w:t>
+        <w:t>{{</w:t>
+      </w:r>
+      <w:proofErr w:type="spellStart"/>
+      <w:r>
+        <w:rPr>
+          <w:rFonts w:ascii="Arial" w:hAnsi="Arial" w:cs="Arial"/>
+          <w:sz w:val="22"/>
+        </w:rPr>
+        <w:t>actual_date_narrative</w:t>
+      </w:r>
+      <w:proofErr w:type="spellEnd"/>
+      <w:r>
+        <w:rPr>
+          <w:rFonts w:ascii="Arial" w:hAnsi="Arial" w:cs="Arial"/>
+          <w:sz w:val="22"/>
+        </w:rPr>
+        <w:t>}}</w:t>
       </w:r>
     </w:p>
     <w:p>
@@ -240,7 +256,33 @@
           <w:shd w:val="clear" w:color="auto" w:fill="FFFFFF"/>
           <w:lang w:val="es-ES"/>
         </w:rPr>
-        <w:t>{{full_name}}</w:t>
+        <w:t>{{</w:t>
+      </w:r>
+      <w:proofErr w:type="spellStart"/>
+      <w:r>
+        <w:rPr>
+          <w:rFonts w:ascii="Segoe UI" w:hAnsi="Segoe UI" w:cs="Segoe UI"/>
+          <w:b/>
+          <w:color w:val="242424"/>
+          <w:sz w:val="21"/>
+          <w:szCs w:val="21"/>
+          <w:shd w:val="clear" w:color="auto" w:fill="FFFFFF"/>
+          <w:lang w:val="es-ES"/>
+        </w:rPr>
+        <w:t>full_name</w:t>
+      </w:r>
+      <w:proofErr w:type="spellEnd"/>
+      <w:r>
+        <w:rPr>
+          <w:rFonts w:ascii="Segoe UI" w:hAnsi="Segoe UI" w:cs="Segoe UI"/>
+          <w:b/>
+          <w:color w:val="242424"/>
+          <w:sz w:val="21"/>
+          <w:szCs w:val="21"/>
+          <w:shd w:val="clear" w:color="auto" w:fill="FFFFFF"/>
+          <w:lang w:val="es-ES"/>
+        </w:rPr>
+        <w:t>}}</w:t>
       </w:r>
       <w:r>
         <w:rPr>
@@ -304,7 +346,31 @@
           <w:sz w:val="22"/>
           <w:lang w:val="es-ES"/>
         </w:rPr>
-        <w:t>{{eq.quantity}}</w:t>
+        <w:t>{{</w:t>
+      </w:r>
+      <w:proofErr w:type="spellStart"/>
+      <w:proofErr w:type="gramStart"/>
+      <w:r>
+        <w:rPr>
+          <w:rFonts w:ascii="Arial" w:hAnsi="Arial" w:cs="Arial"/>
+          <w:b/>
+          <w:bCs/>
+          <w:sz w:val="22"/>
+          <w:lang w:val="es-ES"/>
+        </w:rPr>
+        <w:t>eq.quantity</w:t>
+      </w:r>
+      <w:proofErr w:type="spellEnd"/>
+      <w:proofErr w:type="gramEnd"/>
+      <w:r>
+        <w:rPr>
+          <w:rFonts w:ascii="Arial" w:hAnsi="Arial" w:cs="Arial"/>
+          <w:b/>
+          <w:bCs/>
+          <w:sz w:val="22"/>
+          <w:lang w:val="es-ES"/>
+        </w:rPr>
+        <w:t>}}</w:t>
       </w:r>
       <w:r>
         <w:rPr>
@@ -334,7 +400,51 @@
           <w:sz w:val="22"/>
           <w:lang w:val="es-ES"/>
         </w:rPr>
-        <w:t>{{eq.manufacturer}} {{eq.model}}</w:t>
+        <w:t>{{</w:t>
+      </w:r>
+      <w:proofErr w:type="spellStart"/>
+      <w:r>
+        <w:rPr>
+          <w:rFonts w:ascii="Arial" w:hAnsi="Arial" w:cs="Arial"/>
+          <w:b/>
+          <w:bCs/>
+          <w:sz w:val="22"/>
+          <w:lang w:val="es-ES"/>
+        </w:rPr>
+        <w:t>eq.manufacturer</w:t>
+      </w:r>
+      <w:proofErr w:type="spellEnd"/>
+      <w:r>
+        <w:rPr>
+          <w:rFonts w:ascii="Arial" w:hAnsi="Arial" w:cs="Arial"/>
+          <w:b/>
+          <w:bCs/>
+          <w:sz w:val="22"/>
+          <w:lang w:val="es-ES"/>
+        </w:rPr>
+        <w:t>}} {{</w:t>
+      </w:r>
+      <w:proofErr w:type="spellStart"/>
+      <w:r>
+        <w:rPr>
+          <w:rFonts w:ascii="Arial" w:hAnsi="Arial" w:cs="Arial"/>
+          <w:b/>
+          <w:bCs/>
+          <w:sz w:val="22"/>
+          <w:lang w:val="es-ES"/>
+        </w:rPr>
+        <w:t>eq.model</w:t>
+      </w:r>
+      <w:proofErr w:type="spellEnd"/>
+      <w:r>
+        <w:rPr>
+          <w:rFonts w:ascii="Arial" w:hAnsi="Arial" w:cs="Arial"/>
+          <w:b/>
+          <w:bCs/>
+          <w:sz w:val="22"/>
+          <w:lang w:val="es-ES"/>
+        </w:rPr>
+        <w:t>}}</w:t>
       </w:r>
       <w:r>
         <w:rPr>
@@ -377,7 +487,41 @@
           <w:sz w:val="22"/>
           <w:lang w:val="es-ES"/>
         </w:rPr>
-        <w:t>{{eq.serial_number}}</w:t>
+        <w:t>{{</w:t>
+      </w:r>
+      <w:proofErr w:type="spellStart"/>
+      <w:proofErr w:type="gramStart"/>
+      <w:r>
+        <w:rPr>
+          <w:rFonts w:ascii="Arial" w:hAnsi="Arial" w:cs="Arial"/>
+          <w:b/>
+          <w:bCs/>
+          <w:sz w:val="22"/>
+          <w:lang w:val="es-ES"/>
+        </w:rPr>
+        <w:t>eq.serial</w:t>
+      </w:r>
+      <w:proofErr w:type="gramEnd"/>
+      <w:r>
+        <w:rPr>
+          <w:rFonts w:ascii="Arial" w:hAnsi="Arial" w:cs="Arial"/>
+          <w:b/>
+          <w:bCs/>
+          <w:sz w:val="22"/>
+          <w:lang w:val="es-ES"/>
+        </w:rPr>
+        <w:t>_number</w:t>
+      </w:r>
+      <w:proofErr w:type="spellEnd"/>
+      <w:r>
+        <w:rPr>
+          <w:rFonts w:ascii="Arial" w:hAnsi="Arial" w:cs="Arial"/>
+          <w:b/>
+          <w:bCs/>
+          <w:sz w:val="22"/>
+          <w:lang w:val="es-ES"/>
+        </w:rPr>
+        <w:t>}}</w:t>
       </w:r>
     </w:p>
     <w:p>
@@ -425,6 +569,8 @@
         </w:rPr>
         <w:t>{{</w:t>
       </w:r>
+      <w:proofErr w:type="spellStart"/>
+      <w:proofErr w:type="gramStart"/>
       <w:r>
         <w:rPr>
           <w:b/>
@@ -434,8 +580,21 @@
           <w:shd w:val="clear" w:color="auto" w:fill="FFFFFF"/>
           <w:lang w:val="es-ES"/>
         </w:rPr>
-        <w:t>eq.purchase_cost</w:t>
-      </w:r>
+        <w:t>eq.purchase</w:t>
+      </w:r>
+      <w:proofErr w:type="gramEnd"/>
+      <w:r>
+        <w:rPr>
+          <w:b/>
+          <w:bCs/>
+          <w:sz w:val="22"/>
+          <w:szCs w:val="22"/>
+          <w:shd w:val="clear" w:color="auto" w:fill="FFFFFF"/>
+          <w:lang w:val="es-ES"/>
+        </w:rPr>
+        <w:t>_cost</w:t>
+      </w:r>
+      <w:proofErr w:type="spellEnd"/>
       <w:r>
         <w:rPr>
           <w:b/>
@@ -541,6 +700,7 @@
         </w:rPr>
         <w:t>{{</w:t>
       </w:r>
+      <w:proofErr w:type="spellStart"/>
       <w:r>
         <w:rPr>
           <w:rFonts w:ascii="Arial" w:eastAsiaTheme="minorHAnsi" w:hAnsi="Arial" w:cs="Arial"/>
@@ -550,6 +710,7 @@
         </w:rPr>
         <w:t>eq.purchase_cost</w:t>
       </w:r>
+      <w:proofErr w:type="spellEnd"/>
       <w:r>
         <w:rPr>
           <w:rFonts w:ascii="Arial" w:eastAsiaTheme="minorHAnsi" w:hAnsi="Arial" w:cs="Arial"/>
@@ -575,8 +736,9 @@
           <w:sz w:val="22"/>
           <w:lang w:val="es-ES" w:eastAsia="en-US"/>
         </w:rPr>
-        <w:t>{{text_amount}} dólares</w:t>
-      </w:r>
+        <w:t>{{</w:t>
+      </w:r>
+      <w:proofErr w:type="spellStart"/>
       <w:r>
         <w:rPr>
           <w:rFonts w:ascii="Arial" w:eastAsiaTheme="minorHAnsi" w:hAnsi="Arial" w:cs="Arial"/>
@@ -584,8 +746,9 @@
           <w:sz w:val="22"/>
           <w:lang w:val="es-ES" w:eastAsia="en-US"/>
         </w:rPr>
-        <w:t>) descontado a partir del mes de</w:t>
-      </w:r>
+        <w:t>text_amount</w:t>
+      </w:r>
+      <w:proofErr w:type="spellEnd"/>
       <w:r>
         <w:rPr>
           <w:rFonts w:ascii="Arial" w:eastAsiaTheme="minorHAnsi" w:hAnsi="Arial" w:cs="Arial"/>
@@ -593,8 +756,10 @@
           <w:sz w:val="22"/>
           <w:lang w:val="es-ES" w:eastAsia="en-US"/>
         </w:rPr>
-        <w:t xml:space="preserve"> {{</w:t>
-      </w:r>
+        <w:t>}}</w:t>
+      </w:r>
+      <w:bookmarkStart w:id="0" w:name="_GoBack"/>
+      <w:bookmarkEnd w:id="0"/>
       <w:r>
         <w:rPr>
           <w:rFonts w:ascii="Arial" w:eastAsiaTheme="minorHAnsi" w:hAnsi="Arial" w:cs="Arial"/>
@@ -602,7 +767,7 @@
           <w:sz w:val="22"/>
           <w:lang w:val="es-ES" w:eastAsia="en-US"/>
         </w:rPr>
-        <w:t>d</w:t>
+        <w:t>) descontado a partir del mes de</w:t>
       </w:r>
       <w:r>
         <w:rPr>
@@ -611,8 +776,9 @@
           <w:sz w:val="22"/>
           <w:lang w:val="es-ES" w:eastAsia="en-US"/>
         </w:rPr>
-        <w:t>iscount</w:t>
-      </w:r>
+        <w:t xml:space="preserve"> {{</w:t>
+      </w:r>
+      <w:proofErr w:type="spellStart"/>
       <w:r>
         <w:rPr>
           <w:rFonts w:ascii="Arial" w:eastAsiaTheme="minorHAnsi" w:hAnsi="Arial" w:cs="Arial"/>
@@ -620,7 +786,35 @@
           <w:sz w:val="22"/>
           <w:lang w:val="es-ES" w:eastAsia="en-US"/>
         </w:rPr>
-        <w:t>_month}}</w:t>
+        <w:t>d</w:t>
+      </w:r>
+      <w:r>
+        <w:rPr>
+          <w:rFonts w:ascii="Arial" w:eastAsiaTheme="minorHAnsi" w:hAnsi="Arial" w:cs="Arial"/>
+          <w:color w:val="000000"/>
+          <w:sz w:val="22"/>
+          <w:lang w:val="es-ES" w:eastAsia="en-US"/>
+        </w:rPr>
+        <w:t>iscount</w:t>
+      </w:r>
+      <w:r>
+        <w:rPr>
+          <w:rFonts w:ascii="Arial" w:eastAsiaTheme="minorHAnsi" w:hAnsi="Arial" w:cs="Arial"/>
+          <w:color w:val="000000"/>
+          <w:sz w:val="22"/>
+          <w:lang w:val="es-ES" w:eastAsia="en-US"/>
+        </w:rPr>
+        <w:t>_month</w:t>
+      </w:r>
+      <w:proofErr w:type="spellEnd"/>
+      <w:r>
+        <w:rPr>
+          <w:rFonts w:ascii="Arial" w:eastAsiaTheme="minorHAnsi" w:hAnsi="Arial" w:cs="Arial"/>
+          <w:color w:val="000000"/>
+          <w:sz w:val="22"/>
+          <w:lang w:val="es-ES" w:eastAsia="en-US"/>
+        </w:rPr>
+        <w:t>}}</w:t>
       </w:r>
     </w:p>
     <w:p>
@@ -757,7 +951,27 @@
           <w:sz w:val="22"/>
           <w:lang w:val="es-ES"/>
         </w:rPr>
-        <w:t>{{full_name}}</w:t>
+        <w:t>{{</w:t>
+      </w:r>
+      <w:proofErr w:type="spellStart"/>
+      <w:r>
+        <w:rPr>
+          <w:rFonts w:ascii="Arial" w:hAnsi="Arial" w:cs="Arial"/>
+          <w:b/>
+          <w:sz w:val="22"/>
+          <w:lang w:val="es-ES"/>
+        </w:rPr>
+        <w:t>full_name</w:t>
+      </w:r>
+      <w:proofErr w:type="spellEnd"/>
+      <w:r>
+        <w:rPr>
+          <w:rFonts w:ascii="Arial" w:hAnsi="Arial" w:cs="Arial"/>
+          <w:b/>
+          <w:sz w:val="22"/>
+          <w:lang w:val="es-ES"/>
+        </w:rPr>
+        <w:t>}}</w:t>
       </w:r>
       <w:r>
         <w:rPr>
@@ -801,7 +1015,33 @@
           <w:shd w:val="clear" w:color="auto" w:fill="FFFFFF"/>
           <w:lang w:val="es-ES"/>
         </w:rPr>
-        <w:t>{{national_id}}</w:t>
+        <w:t>{{</w:t>
+      </w:r>
+      <w:proofErr w:type="spellStart"/>
+      <w:r>
+        <w:rPr>
+          <w:rFonts w:ascii="Segoe UI" w:hAnsi="Segoe UI" w:cs="Segoe UI"/>
+          <w:b/>
+          <w:color w:val="242424"/>
+          <w:sz w:val="21"/>
+          <w:szCs w:val="21"/>
+          <w:shd w:val="clear" w:color="auto" w:fill="FFFFFF"/>
+          <w:lang w:val="es-ES"/>
+        </w:rPr>
+        <w:t>national_id</w:t>
+      </w:r>
+      <w:proofErr w:type="spellEnd"/>
+      <w:r>
+        <w:rPr>
+          <w:rFonts w:ascii="Segoe UI" w:hAnsi="Segoe UI" w:cs="Segoe UI"/>
+          <w:b/>
+          <w:color w:val="242424"/>
+          <w:sz w:val="21"/>
+          <w:szCs w:val="21"/>
+          <w:shd w:val="clear" w:color="auto" w:fill="FFFFFF"/>
+          <w:lang w:val="es-ES"/>
+        </w:rPr>
+        <w:t>}}</w:t>
       </w:r>
     </w:p>
     <w:p>
@@ -847,7 +1087,7 @@
 </file>
 
 <file path=word/styles.xml><?xml version="1.0" encoding="utf-8"?>
-<w:styles xmlns:mc="http://schemas.openxmlformats.org/markup-compatibility/2006" xmlns:r="http://schemas.openxmlformats.org/officeDocument/2006/relationships" xmlns:w="http://schemas.openxmlformats.org/wordprocessingml/2006/main" xmlns:w14="http://schemas.microsoft.com/office/word/2010/wordml" xmlns:w15="http://schemas.microsoft.com/office/word/2012/wordml" xmlns:w16cex="http://schemas.microsoft.com/office/word/2018/wordml/cex" xmlns:w16cid="http://schemas.microsoft.com/office/word/2016/wordml/cid" xmlns:w16="http://schemas.microsoft.com/office/word/2018/wordml" xmlns:w16se="http://schemas.microsoft.com/office/word/2015/wordml/symex" mc:Ignorable="w14 w15 w16se w16cid w16 w16cex">
+<w:styles xmlns:mc="http://schemas.openxmlformats.org/markup-compatibility/2006" xmlns:r="http://schemas.openxmlformats.org/officeDocument/2006/relationships" xmlns:w="http://schemas.openxmlformats.org/wordprocessingml/2006/main" xmlns:w14="http://schemas.microsoft.com/office/word/2010/wordml" xmlns:w15="http://schemas.microsoft.com/office/word/2012/wordml" xmlns:w16se="http://schemas.microsoft.com/office/word/2015/wordml/symex" mc:Ignorable="w14 w15 w16se">
   <w:docDefaults>
     <w:rPrDefault>
       <w:rPr>
@@ -864,7 +1104,7 @@
       </w:pPr>
     </w:pPrDefault>
   </w:docDefaults>
-  <w:latentStyles w:defLockedState="0" w:defUIPriority="99" w:defSemiHidden="0" w:defUnhideWhenUsed="0" w:defQFormat="0" w:count="376">
+  <w:latentStyles w:defLockedState="0" w:defUIPriority="99" w:defSemiHidden="0" w:defUnhideWhenUsed="0" w:defQFormat="0" w:count="371">
     <w:lsdException w:name="Normal" w:uiPriority="0" w:qFormat="1"/>
     <w:lsdException w:name="heading 1" w:uiPriority="9" w:qFormat="1"/>
     <w:lsdException w:name="heading 2" w:semiHidden="1" w:uiPriority="9" w:unhideWhenUsed="1" w:qFormat="1"/>
@@ -1236,11 +1476,6 @@
     <w:lsdException w:name="List Table 5 Dark Accent 6" w:uiPriority="50"/>
     <w:lsdException w:name="List Table 6 Colorful Accent 6" w:uiPriority="51"/>
     <w:lsdException w:name="List Table 7 Colorful Accent 6" w:uiPriority="52"/>
-    <w:lsdException w:name="Mention" w:semiHidden="1" w:unhideWhenUsed="1"/>
-    <w:lsdException w:name="Smart Hyperlink" w:semiHidden="1" w:unhideWhenUsed="1"/>
-    <w:lsdException w:name="Hashtag" w:semiHidden="1" w:unhideWhenUsed="1"/>
-    <w:lsdException w:name="Unresolved Mention" w:semiHidden="1" w:unhideWhenUsed="1"/>
-    <w:lsdException w:name="Smart Link" w:semiHidden="1" w:unhideWhenUsed="1"/>
   </w:latentStyles>
   <w:style w:type="paragraph" w:default="1" w:styleId="Normal">
     <w:name w:val="Normal"/>
@@ -1651,6 +1886,12 @@
 </file>
 
 <file path=customXml/item2.xml><?xml version="1.0" encoding="utf-8"?>
+<p:properties xmlns:p="http://schemas.microsoft.com/office/2006/metadata/properties" xmlns:xsi="http://www.w3.org/2001/XMLSchema-instance" xmlns:pc="http://schemas.microsoft.com/office/infopath/2007/PartnerControls">
+  <documentManagement/>
+</p:properties>
+</file>
+
+<file path=customXml/item3.xml><?xml version="1.0" encoding="utf-8"?>
 <ct:contentTypeSchema xmlns:ct="http://schemas.microsoft.com/office/2006/metadata/contentType" xmlns:ma="http://schemas.microsoft.com/office/2006/metadata/properties/metaAttributes" ct:_="" ma:_="" ma:contentTypeName="Documento" ma:contentTypeID="0x01010023B1EDD83301D64894DA276ADFC5ABC1" ma:contentTypeVersion="13" ma:contentTypeDescription="Crear nuevo documento." ma:contentTypeScope="" ma:versionID="67f751fff93dca1bbac0aed91435f049">
   <xsd:schema xmlns:xsd="http://www.w3.org/2001/XMLSchema" xmlns:xs="http://www.w3.org/2001/XMLSchema" xmlns:p="http://schemas.microsoft.com/office/2006/metadata/properties" xmlns:ns2="dbdd3ce6-2708-42a1-8491-2232cd352f7d" xmlns:ns3="762911f0-14dc-41b2-8e3a-9f362923577d" targetNamespace="http://schemas.microsoft.com/office/2006/metadata/properties" ma:root="true" ma:fieldsID="4e12b7905990dd5f0f5741ea9c62a4ce" ns2:_="" ns3:_="">
     <xsd:import namespace="dbdd3ce6-2708-42a1-8491-2232cd352f7d"/>
@@ -1871,12 +2112,6 @@
 </ct:contentTypeSchema>
 </file>
 
-<file path=customXml/item3.xml><?xml version="1.0" encoding="utf-8"?>
-<p:properties xmlns:p="http://schemas.microsoft.com/office/2006/metadata/properties" xmlns:xsi="http://www.w3.org/2001/XMLSchema-instance" xmlns:pc="http://schemas.microsoft.com/office/infopath/2007/PartnerControls">
-  <documentManagement/>
-</p:properties>
-</file>
-
 <file path=customXml/itemProps1.xml><?xml version="1.0" encoding="utf-8"?>
 <ds:datastoreItem xmlns:ds="http://schemas.openxmlformats.org/officeDocument/2006/customXml" ds:itemID="{435D44D5-85EC-44EF-954F-87D764558564}">
   <ds:schemaRefs>
@@ -1886,6 +2121,15 @@
 </file>
 
 <file path=customXml/itemProps2.xml><?xml version="1.0" encoding="utf-8"?>
+<ds:datastoreItem xmlns:ds="http://schemas.openxmlformats.org/officeDocument/2006/customXml" ds:itemID="{93F9353E-587F-41BC-A6C4-F6AB4E5C6772}">
+  <ds:schemaRefs>
+    <ds:schemaRef ds:uri="http://schemas.microsoft.com/office/2006/metadata/properties"/>
+    <ds:schemaRef ds:uri="http://schemas.microsoft.com/office/infopath/2007/PartnerControls"/>
+  </ds:schemaRefs>
+</ds:datastoreItem>
+</file>
+
+<file path=customXml/itemProps3.xml><?xml version="1.0" encoding="utf-8"?>
 <ds:datastoreItem xmlns:ds="http://schemas.openxmlformats.org/officeDocument/2006/customXml" ds:itemID="{3D433707-2194-4CD9-B606-746FD6688205}">
   <ds:schemaRefs>
     <ds:schemaRef ds:uri="http://schemas.microsoft.com/office/2006/metadata/contentType"/>
@@ -1902,13 +2146,4 @@
     <ds:schemaRef ds:uri="http://schemas.microsoft.com/internal/obd"/>
   </ds:schemaRefs>
 </ds:datastoreItem>
-</file>
-
-<file path=customXml/itemProps3.xml><?xml version="1.0" encoding="utf-8"?>
-<ds:datastoreItem xmlns:ds="http://schemas.openxmlformats.org/officeDocument/2006/customXml" ds:itemID="{93F9353E-587F-41BC-A6C4-F6AB4E5C6772}">
-  <ds:schemaRefs>
-    <ds:schemaRef ds:uri="http://schemas.microsoft.com/office/2006/metadata/properties"/>
-    <ds:schemaRef ds:uri="http://schemas.microsoft.com/office/infopath/2007/PartnerControls"/>
-  </ds:schemaRefs>
-</ds:datastoreItem>
 </file>
</xml_diff>